<commit_message>
Exam 2 study guide: drop the GMO yeast lecture (not covered in class)
Removes Lecture 12 material (flocculation engineering, gene editing,
engineered traits, immobilized yeast) and replaces the two review
questions that depended on it. ALDC stays in the diacetyl section
because Lecture 9 covers it; domestication stays because Lecture 10
covers it.

Co-Authored-By: Claude Opus 5.5 <noreply@anthropic.com>
Claude-Session: https://claude.ai/code/session_017Wu8ndyp5Vw5tEgq4ucur1
</commit_message>
<xml_diff>
--- a/brew-mud/docs/BBMB_1200_Second_Test_Study_Guide.docx
+++ b/brew-mud/docs/BBMB_1200_Second_Test_Study_Guide.docx
@@ -15,19 +15,19 @@
         <w:pStyle w:val="Heading2"/>
       </w:pPr>
       <w:r>
-        <w:t>Yeast, fermentation, flavor, sulfur, yeast engineering, and browning</w:t>
+        <w:t>Yeast, fermentation, flavor, sulfur, domestication, and browning</w:t>
       </w:r>
     </w:p>
     <w:p>
       <w:pPr/>
       <w:r>
-        <w:t>This conventional study guide covers the second-exam material: Lecture 7 (Yeast), Lecture 8 (Yeast maltose metabolism), Lecture 9 (More yeast metabolism), Lecture 10 (Yeast and sulfur), Lecture 12 (GMO yeast), and the browning slide from the Exam 2 review. Use the summaries to organize the major ideas, then answer the review questions without looking back. Check your reasoning with the answer key at the end.</w:t>
+        <w:t>This conventional study guide covers the second-exam material: Lecture 7 (Yeast), Lecture 8 (Yeast maltose metabolism), Lecture 9 (More yeast metabolism), Lecture 10 (Yeast and sulfur), and the browning slide from the Exam 2 review. Use the summaries to organize the major ideas, then answer the review questions without looking back. Check your reasoning with the answer key at the end.</w:t>
       </w:r>
     </w:p>
     <w:p>
       <w:pPr/>
       <w:r>
-        <w:t>The central goal is to explain relationships: how yeast take up and use wort sugars, how oxygen and growth conditions shape flavor compounds, where sulfur aromas come from, and what brewers gain or risk when they select or engineer yeast.</w:t>
+        <w:t>The central goal is to explain relationships: how yeast take up and use wort sugars, how oxygen and growth conditions shape flavor compounds, where sulfur aromas come from, and what domestication has done to brewing yeast.</w:t>
       </w:r>
     </w:p>
     <w:p>
@@ -218,7 +218,7 @@
         </w:numPr>
       </w:pPr>
       <w:r>
-        <w:t>Evaluate examples of yeast domestication and genetic engineering, including their trade-offs.</w:t>
+        <w:t>Explain what yeast domestication studies show, and what they do not show.</w:t>
       </w:r>
     </w:p>
     <w:p>
@@ -1341,6 +1341,21 @@
       </w:r>
     </w:p>
     <w:p>
+      <w:pPr/>
+      <w:r>
+        <w:t xml:space="preserve">A second approach prevents diacetyl instead of removing it. The enzyme </w:t>
+      </w:r>
+      <w:r>
+        <w:rPr>
+          <w:b/>
+        </w:rPr>
+        <w:t>ALDC</w:t>
+      </w:r>
+      <w:r>
+        <w:t xml:space="preserve"> (alpha-acetolactate decarboxylase) diverts the precursor alpha-acetolactate to acetoin before diacetyl can form.</w:t>
+      </w:r>
+    </w:p>
+    <w:p>
       <w:pPr>
         <w:pStyle w:val="Heading2"/>
       </w:pPr>
@@ -1648,15 +1663,7 @@
         <w:pStyle w:val="Heading2"/>
       </w:pPr>
       <w:r>
-        <w:t>5. Yeast domestication and engineering</w:t>
-      </w:r>
-    </w:p>
-    <w:p>
-      <w:pPr>
-        <w:pStyle w:val="Heading3"/>
-      </w:pPr>
-      <w:r>
-        <w:t>Domestication</w:t>
+        <w:t>5. Yeast domestication</w:t>
       </w:r>
     </w:p>
     <w:p>
@@ -1708,407 +1715,6 @@
       </w:r>
       <w:r>
         <w:t>.</w:t>
-      </w:r>
-    </w:p>
-    <w:p>
-      <w:pPr>
-        <w:pStyle w:val="Heading3"/>
-      </w:pPr>
-      <w:r>
-        <w:t>Flocculation</w:t>
-      </w:r>
-    </w:p>
-    <w:p>
-      <w:pPr/>
-      <w:r>
-        <w:rPr>
-          <w:b/>
-        </w:rPr>
-        <w:t>Flocculation</w:t>
-      </w:r>
-      <w:r>
-        <w:t xml:space="preserve"> is yeast cells clumping together and settling. It clarifies beer and makes yeast easier to collect. Timing matters: if yeast flocculate too early, they can settle before fermentation is complete. A strain engineered for stronger flocculation should be tested for settling time, fermentation completion, and final flavor.</w:t>
-      </w:r>
-    </w:p>
-    <w:p>
-      <w:pPr>
-        <w:pStyle w:val="Heading3"/>
-      </w:pPr>
-      <w:r>
-        <w:t>Genetic engineering</w:t>
-      </w:r>
-    </w:p>
-    <w:p>
-      <w:pPr/>
-      <w:r>
-        <w:t xml:space="preserve">Genetic engineering changes a cell's </w:t>
-      </w:r>
-      <w:r>
-        <w:rPr>
-          <w:b/>
-        </w:rPr>
-        <w:t>DNA</w:t>
-      </w:r>
-      <w:r>
-        <w:t>, which changes the proteins it makes and what it does.</w:t>
-      </w:r>
-    </w:p>
-    <w:p>
-      <w:pPr>
-        <w:pStyle w:val="ListParagraph"/>
-        <w:numPr>
-          <w:ilvl w:val="0"/>
-          <w:numId w:val="1"/>
-        </w:numPr>
-      </w:pPr>
-      <w:r>
-        <w:rPr>
-          <w:b/>
-        </w:rPr>
-        <w:t>Gene editing</w:t>
-      </w:r>
-      <w:r>
-        <w:t xml:space="preserve"> is a targeted change to DNA. An edit can insert foreign DNA, but it does not have to.</w:t>
-      </w:r>
-    </w:p>
-    <w:p>
-      <w:pPr>
-        <w:pStyle w:val="ListParagraph"/>
-        <w:numPr>
-          <w:ilvl w:val="0"/>
-          <w:numId w:val="1"/>
-        </w:numPr>
-      </w:pPr>
-      <w:r>
-        <w:rPr>
-          <w:b/>
-        </w:rPr>
-        <w:t>Transgenesis</w:t>
-      </w:r>
-      <w:r>
-        <w:t xml:space="preserve"> introduces a gene from an unrelated species.</w:t>
-      </w:r>
-    </w:p>
-    <w:tbl>
-      <w:tblPr>
-        <w:tblStyle w:val="TableGrid"/>
-        <w:tblW w:w="0" w:type="auto"/>
-        <w:tblCaption w:val="Reference table: Engineered trait; What it does; Caution"/>
-        <w:tblDescription w:val="A reference table with columns: Engineered trait, What it does, Caution"/>
-      </w:tblPr>
-      <w:tblGrid>
-        <w:gridCol w:w="2200"/>
-        <w:gridCol w:w="3200"/>
-        <w:gridCol w:w="3400"/>
-      </w:tblGrid>
-      <w:tr>
-        <w:trPr>
-          <w:tblHeader/>
-        </w:trPr>
-        <w:tc>
-          <w:tcPr>
-            <w:tcW w:w="0" w:type="auto"/>
-            <w:shd w:fill="F1BE48"/>
-          </w:tcPr>
-          <w:p>
-            <w:pPr/>
-            <w:r>
-              <w:rPr>
-                <w:b/>
-              </w:rPr>
-              <w:t>Engineered trait</w:t>
-            </w:r>
-          </w:p>
-        </w:tc>
-        <w:tc>
-          <w:tcPr>
-            <w:tcW w:w="0" w:type="auto"/>
-            <w:shd w:fill="F1BE48"/>
-          </w:tcPr>
-          <w:p>
-            <w:pPr/>
-            <w:r>
-              <w:rPr>
-                <w:b/>
-              </w:rPr>
-              <w:t>What it does</w:t>
-            </w:r>
-          </w:p>
-        </w:tc>
-        <w:tc>
-          <w:tcPr>
-            <w:tcW w:w="0" w:type="auto"/>
-            <w:shd w:fill="F1BE48"/>
-          </w:tcPr>
-          <w:p>
-            <w:pPr/>
-            <w:r>
-              <w:rPr>
-                <w:b/>
-              </w:rPr>
-              <w:t>Caution</w:t>
-            </w:r>
-          </w:p>
-        </w:tc>
-      </w:tr>
-      <w:tr>
-        <w:tc>
-          <w:tcPr>
-            <w:tcW w:w="0" w:type="auto"/>
-          </w:tcPr>
-          <w:p>
-            <w:pPr/>
-            <w:r>
-              <w:t>Glucoamylase</w:t>
-            </w:r>
-          </w:p>
-        </w:tc>
-        <w:tc>
-          <w:tcPr>
-            <w:tcW w:w="0" w:type="auto"/>
-          </w:tcPr>
-          <w:p>
-            <w:pPr/>
-            <w:r>
-              <w:t>Breaks dextrins into fermentable sugars, giving a drier beer</w:t>
-            </w:r>
-          </w:p>
-        </w:tc>
-        <w:tc>
-          <w:tcPr>
-            <w:tcW w:w="0" w:type="auto"/>
-          </w:tcPr>
-          <w:p>
-            <w:pPr/>
-            <w:r>
-              <w:t>More ethanol also carries calories, so the beer is not automatically lower in calories</w:t>
-            </w:r>
-          </w:p>
-        </w:tc>
-      </w:tr>
-      <w:tr>
-        <w:tc>
-          <w:tcPr>
-            <w:tcW w:w="0" w:type="auto"/>
-          </w:tcPr>
-          <w:p>
-            <w:pPr/>
-            <w:r>
-              <w:t>ALDC (alpha-acetolactate decarboxylase)</w:t>
-            </w:r>
-          </w:p>
-        </w:tc>
-        <w:tc>
-          <w:tcPr>
-            <w:tcW w:w="0" w:type="auto"/>
-          </w:tcPr>
-          <w:p>
-            <w:pPr/>
-            <w:r>
-              <w:t>Diverts alpha-acetolactate to acetoin before diacetyl forms</w:t>
-            </w:r>
-          </w:p>
-        </w:tc>
-        <w:tc>
-          <w:tcPr>
-            <w:tcW w:w="0" w:type="auto"/>
-          </w:tcPr>
-          <w:p>
-            <w:pPr/>
-            <w:r>
-              <w:t>Prevents diacetyl rather than removing it afterward</w:t>
-            </w:r>
-          </w:p>
-        </w:tc>
-      </w:tr>
-      <w:tr>
-        <w:tc>
-          <w:tcPr>
-            <w:tcW w:w="0" w:type="auto"/>
-          </w:tcPr>
-          <w:p>
-            <w:pPr/>
-            <w:r>
-              <w:t>More glycerol</w:t>
-            </w:r>
-          </w:p>
-        </w:tc>
-        <w:tc>
-          <w:tcPr>
-            <w:tcW w:w="0" w:type="auto"/>
-          </w:tcPr>
-          <w:p>
-            <w:pPr/>
-            <w:r>
-              <w:t>Redirects some sugar into glycerol</w:t>
-            </w:r>
-          </w:p>
-        </w:tc>
-        <w:tc>
-          <w:tcPr>
-            <w:tcW w:w="0" w:type="auto"/>
-          </w:tcPr>
-          <w:p>
-            <w:pPr/>
-            <w:r>
-              <w:t>Lowers alcohol yield; flavor and fermentation performance still need checking</w:t>
-            </w:r>
-          </w:p>
-        </w:tc>
-      </w:tr>
-      <w:tr>
-        <w:tc>
-          <w:tcPr>
-            <w:tcW w:w="0" w:type="auto"/>
-          </w:tcPr>
-          <w:p>
-            <w:pPr/>
-            <w:r>
-              <w:t>Linalool and geraniol</w:t>
-            </w:r>
-          </w:p>
-        </w:tc>
-        <w:tc>
-          <w:tcPr>
-            <w:tcW w:w="0" w:type="auto"/>
-          </w:tcPr>
-          <w:p>
-            <w:pPr/>
-            <w:r>
-              <w:t>Floral or citrus aroma made by the yeast</w:t>
-            </w:r>
-          </w:p>
-        </w:tc>
-        <w:tc>
-          <w:tcPr>
-            <w:tcW w:w="0" w:type="auto"/>
-          </w:tcPr>
-          <w:p>
-            <w:pPr/>
-            <w:r>
-              <w:t>Adds aroma but does not replace hop bitterness, and stronger aroma is not proof of better taste</w:t>
-            </w:r>
-          </w:p>
-        </w:tc>
-      </w:tr>
-      <w:tr>
-        <w:tc>
-          <w:tcPr>
-            <w:tcW w:w="0" w:type="auto"/>
-          </w:tcPr>
-          <w:p>
-            <w:pPr/>
-            <w:r>
-              <w:t>Thiol release</w:t>
-            </w:r>
-          </w:p>
-        </w:tc>
-        <w:tc>
-          <w:tcPr>
-            <w:tcW w:w="0" w:type="auto"/>
-          </w:tcPr>
-          <w:p>
-            <w:pPr/>
-            <w:r>
-              <w:t>Tropical aroma</w:t>
-            </w:r>
-          </w:p>
-        </w:tc>
-        <w:tc>
-          <w:tcPr>
-            <w:tcW w:w="0" w:type="auto"/>
-          </w:tcPr>
-          <w:p>
-            <w:pPr/>
-            <w:r>
-              <w:t>Frees aroma compounds already bound in the ingredients, rather than making new ones</w:t>
-            </w:r>
-          </w:p>
-        </w:tc>
-      </w:tr>
-      <w:tr>
-        <w:tc>
-          <w:tcPr>
-            <w:tcW w:w="0" w:type="auto"/>
-          </w:tcPr>
-          <w:p>
-            <w:pPr/>
-            <w:r>
-              <w:t>Urea breakdown (wine yeast)</w:t>
-            </w:r>
-          </w:p>
-        </w:tc>
-        <w:tc>
-          <w:tcPr>
-            <w:tcW w:w="0" w:type="auto"/>
-          </w:tcPr>
-          <w:p>
-            <w:pPr/>
-            <w:r>
-              <w:t>Less ethyl carbamate</w:t>
-            </w:r>
-          </w:p>
-        </w:tc>
-        <w:tc>
-          <w:tcPr>
-            <w:tcW w:w="0" w:type="auto"/>
-          </w:tcPr>
-          <w:p>
-            <w:pPr/>
-            <w:r>
-              <w:t>Removes a precursor that reacts with ethanol</w:t>
-            </w:r>
-          </w:p>
-        </w:tc>
-      </w:tr>
-      <w:tr>
-        <w:tc>
-          <w:tcPr>
-            <w:tcW w:w="0" w:type="auto"/>
-          </w:tcPr>
-          <w:p>
-            <w:pPr/>
-            <w:r>
-              <w:t>Blocked sulfite reductase</w:t>
-            </w:r>
-          </w:p>
-        </w:tc>
-        <w:tc>
-          <w:tcPr>
-            <w:tcW w:w="0" w:type="auto"/>
-          </w:tcPr>
-          <w:p>
-            <w:pPr/>
-            <w:r>
-              <w:t>More sulfite accumulates</w:t>
-            </w:r>
-          </w:p>
-        </w:tc>
-        <w:tc>
-          <w:tcPr>
-            <w:tcW w:w="0" w:type="auto"/>
-          </w:tcPr>
-          <w:p>
-            <w:pPr/>
-            <w:r>
-              <w:t>Aims at better flavor stability</w:t>
-            </w:r>
-          </w:p>
-        </w:tc>
-      </w:tr>
-    </w:tbl>
-    <w:p>
-      <w:pPr>
-        <w:pStyle w:val="Heading3"/>
-      </w:pPr>
-      <w:r>
-        <w:t>Immobilized yeast and continuous fermentation</w:t>
-      </w:r>
-    </w:p>
-    <w:p>
-      <w:pPr/>
-      <w:r>
-        <w:t>Holding yeast in a material keeps a high density of active cells in contact with wort flowing past them, which can make continuous fermentation very fast. Speed is not enough to establish a working beer process. Flavor development, conditioning, contamination control, and reliable operation still matter.</w:t>
       </w:r>
     </w:p>
     <w:p>
@@ -2601,7 +2207,7 @@
         </w:numPr>
       </w:pPr>
       <w:r>
-        <w:t>An engineered strain with glucoamylase makes a drier beer. Will it necessarily be lower in calories? Explain.</w:t>
+        <w:t>A yeast strain lacking sulfite reductase is proposed for better flavor stability. Explain the reasoning.</w:t>
       </w:r>
     </w:p>
     <w:p>
@@ -2613,7 +2219,7 @@
         </w:numPr>
       </w:pPr>
       <w:r>
-        <w:t>A newly engineered strain flocculates strongly and the beer clears quickly. What else must be measured before calling the strain an improvement?</w:t>
+        <w:t>A farmhouse yeast tolerates stress better than some industrial strains. What does this suggest about domestication?</w:t>
       </w:r>
     </w:p>
     <w:p>
@@ -2971,7 +2577,7 @@
         </w:numPr>
       </w:pPr>
       <w:r>
-        <w:t>Not necessarily. Glucoamylase turns dextrins into fermentable sugar, so less carbohydrate remains, but more of it becomes ethanol, which also has calories. Calories depend on the final composition.</w:t>
+        <w:t>Sulfite reductase converts sulfite toward sulfide. Without it, more sulfite accumulates. Sulfite (as bisulfite) acts as an antioxidant and reacts with staling carbonyls such as trans-2-nonenal, so the beer can stay fresh longer.</w:t>
       </w:r>
     </w:p>
     <w:p>
@@ -2983,7 +2589,7 @@
         </w:numPr>
       </w:pPr>
       <w:r>
-        <w:t>Measure when the yeast settle, whether fermentation still finishes, and the final flavor. Flocculating too early can leave sugar unfermented, so a clearer beer alone does not show an improvement.</w:t>
+        <w:t>Domestication outcomes depend on which traits brewers selected. Different brewing environments and selection histories can preserve different traits, such as stress tolerance in farmhouse yeasts.</w:t>
       </w:r>
     </w:p>
     <w:p>
@@ -3018,7 +2624,7 @@
         <w:rPr>
           <w:b/>
         </w:rPr>
-        <w:t>Selected yeast (ale, lager, or specialty) → early oxygen for ergosterol and unsaturated fatty acids → glucose used first, then maltose by proton-coupled uptake and maltase → glycolysis yielding net ATP and NADH → ethanol and CO₂ regenerating NAD⁺ (favored at high sugar by the Crabtree effect) → flavor from esters, higher alcohols, and phenolics → diacetyl cleanup during maturation → sulfur control through boiling, cooling, and bisulfite → domestication and engineering that trade one trait against another.</w:t>
+        <w:t>Selected yeast (ale, lager, or specialty) → early oxygen for ergosterol and unsaturated fatty acids → glucose used first, then maltose by proton-coupled uptake and maltase → glycolysis yielding net ATP and NADH → ethanol and CO₂ regenerating NAD⁺ (favored at high sugar by the Crabtree effect) → flavor from esters, higher alcohols, and phenolics → diacetyl cleanup during maturation → sulfur control through boiling, cooling, and bisulfite → domestication that shaped which traits brewing yeasts kept.</w:t>
       </w:r>
     </w:p>
     <w:sectPr>

</xml_diff>